<commit_message>
Actualiza nombre oficial de la etapa B2
</commit_message>
<xml_diff>
--- a/outputs/documentos_tfg/metodologia_desarrollada_tfg.docx
+++ b/outputs/documentos_tfg/metodologia_desarrollada_tfg.docx
@@ -167,7 +167,7 @@
           <w:rFonts w:ascii="Times New Roman" w:hAnsi="Times New Roman"/>
           <w:sz w:val="24"/>
         </w:rPr>
-        <w:t>El Escenario B representa una alternativa en la que los purines se almacenan y se aplican directamente en campo. Sus etapas son B1: Almacenamiento de purines y B2: Aplicación en campo.</w:t>
+        <w:t>El Escenario B representa una alternativa en la que los purines se almacenan y se aplican directamente en campo de pastoreo. Sus etapas son B1: Almacenamiento de purines y B2: Aplicación de purines en campo de pastoreo.</w:t>
       </w:r>
     </w:p>
     <w:p>
@@ -263,7 +263,7 @@
           <w:rFonts w:ascii="Times New Roman" w:hAnsi="Times New Roman"/>
           <w:sz w:val="24"/>
         </w:rPr>
-        <w:t>B1: Almacenamiento de purines corresponde al almacenamiento de la mezcla líquida de estiércol, orina, agua de lavado y residuos arrastrados antes de su aplicación. B2: Aplicación en campo corresponde a la aplicación directa de purines sobre el terreno.</w:t>
+        <w:t>B1: Almacenamiento de purines corresponde al almacenamiento de la mezcla líquida de estiércol, orina, agua de lavado y residuos arrastrados antes de su aplicación. B2: Aplicación de purines en campo de pastoreo corresponde a la aplicación directa de purines sobre el terreno.</w:t>
       </w:r>
     </w:p>
     <w:p>
@@ -1578,7 +1578,7 @@
           </w:tcPr>
           <w:p>
             <w:r>
-              <w:t>B2: Aplicación en campo</w:t>
+              <w:t>B2: Aplicación de purines en campo de pastoreo</w:t>
             </w:r>
           </w:p>
         </w:tc>
@@ -1635,7 +1635,7 @@
           </w:tcPr>
           <w:p>
             <w:r>
-              <w:t>B2: Aplicación en campo</w:t>
+              <w:t>B2: Aplicación de purines en campo de pastoreo</w:t>
             </w:r>
           </w:p>
         </w:tc>
@@ -1692,7 +1692,7 @@
           </w:tcPr>
           <w:p>
             <w:r>
-              <w:t>B2: Aplicación en campo</w:t>
+              <w:t>B2: Aplicación de purines en campo de pastoreo</w:t>
             </w:r>
           </w:p>
         </w:tc>
@@ -4052,7 +4052,7 @@
           </w:tcPr>
           <w:p>
             <w:r>
-              <w:t>B2: Aplicación en campo</w:t>
+              <w:t>B2: Aplicación de purines en campo de pastoreo</w:t>
             </w:r>
           </w:p>
         </w:tc>
@@ -4120,7 +4120,7 @@
           </w:tcPr>
           <w:p>
             <w:r>
-              <w:t>B2: Aplicación en campo</w:t>
+              <w:t>B2: Aplicación de purines en campo de pastoreo</w:t>
             </w:r>
           </w:p>
         </w:tc>
@@ -4188,7 +4188,7 @@
           </w:tcPr>
           <w:p>
             <w:r>
-              <w:t>B2: Aplicación en campo</w:t>
+              <w:t>B2: Aplicación de purines en campo de pastoreo</w:t>
             </w:r>
           </w:p>
         </w:tc>
@@ -4254,7 +4254,7 @@
           </w:tcPr>
           <w:p>
             <w:r>
-              <w:t>B2: Aplicación en campo</w:t>
+              <w:t>B2: Aplicación de purines en campo de pastoreo</w:t>
             </w:r>
           </w:p>
         </w:tc>
@@ -4322,7 +4322,7 @@
           </w:tcPr>
           <w:p>
             <w:r>
-              <w:t>B2: Aplicación en campo</w:t>
+              <w:t>B2: Aplicación de purines en campo de pastoreo</w:t>
             </w:r>
           </w:p>
         </w:tc>
@@ -4390,7 +4390,7 @@
           </w:tcPr>
           <w:p>
             <w:r>
-              <w:t>B2: Aplicación en campo</w:t>
+              <w:t>B2: Aplicación de purines en campo de pastoreo</w:t>
             </w:r>
           </w:p>
         </w:tc>
@@ -9141,7 +9141,7 @@
           </w:tcPr>
           <w:p>
             <w:r>
-              <w:t>B2: Aplicación en campo</w:t>
+              <w:t>B2: Aplicación de purines en campo de pastoreo</w:t>
             </w:r>
           </w:p>
         </w:tc>
@@ -9231,7 +9231,7 @@
           </w:tcPr>
           <w:p>
             <w:r>
-              <w:t>B2: Aplicación en campo</w:t>
+              <w:t>B2: Aplicación de purines en campo de pastoreo</w:t>
             </w:r>
           </w:p>
         </w:tc>
@@ -9321,7 +9321,7 @@
           </w:tcPr>
           <w:p>
             <w:r>
-              <w:t>B2: Aplicación en campo</w:t>
+              <w:t>B2: Aplicación de purines en campo de pastoreo</w:t>
             </w:r>
           </w:p>
         </w:tc>
@@ -9409,7 +9409,7 @@
           </w:tcPr>
           <w:p>
             <w:r>
-              <w:t>B2: Aplicación en campo</w:t>
+              <w:t>B2: Aplicación de purines en campo de pastoreo</w:t>
             </w:r>
           </w:p>
         </w:tc>
@@ -9499,7 +9499,7 @@
           </w:tcPr>
           <w:p>
             <w:r>
-              <w:t>B2: Aplicación en campo</w:t>
+              <w:t>B2: Aplicación de purines en campo de pastoreo</w:t>
             </w:r>
           </w:p>
         </w:tc>
@@ -9589,7 +9589,7 @@
           </w:tcPr>
           <w:p>
             <w:r>
-              <w:t>B2: Aplicación en campo</w:t>
+              <w:t>B2: Aplicación de purines en campo de pastoreo</w:t>
             </w:r>
           </w:p>
         </w:tc>
@@ -9679,7 +9679,7 @@
           </w:tcPr>
           <w:p>
             <w:r>
-              <w:t>B2: Aplicación en campo</w:t>
+              <w:t>B2: Aplicación de purines en campo de pastoreo</w:t>
             </w:r>
           </w:p>
         </w:tc>
@@ -9769,7 +9769,7 @@
           </w:tcPr>
           <w:p>
             <w:r>
-              <w:t>B2: Aplicación en campo</w:t>
+              <w:t>B2: Aplicación de purines en campo de pastoreo</w:t>
             </w:r>
           </w:p>
         </w:tc>

</xml_diff>

<commit_message>
Fix heading colors and annual unit spelling
</commit_message>
<xml_diff>
--- a/outputs/documentos_tfg/metodologia_desarrollada_tfg.docx
+++ b/outputs/documentos_tfg/metodologia_desarrollada_tfg.docx
@@ -9,6 +9,7 @@
       <w:r>
         <w:rPr>
           <w:rFonts w:ascii="Times New Roman" w:hAnsi="Times New Roman"/>
+          <w:color w:val="000000"/>
         </w:rPr>
         <w:t>Metodología desarrollada del Análisis de Ciclo de Vida</w:t>
       </w:r>
@@ -20,6 +21,7 @@
       <w:r>
         <w:rPr>
           <w:rFonts w:ascii="Times New Roman" w:hAnsi="Times New Roman"/>
+          <w:color w:val="000000"/>
         </w:rPr>
         <w:t>1. Enfoque metodológico general del ACV</w:t>
       </w:r>
@@ -59,6 +61,7 @@
       <w:r>
         <w:rPr>
           <w:rFonts w:ascii="Times New Roman" w:hAnsi="Times New Roman"/>
+          <w:color w:val="000000"/>
         </w:rPr>
         <w:t>2. Sitio de estudio</w:t>
       </w:r>
@@ -98,6 +101,7 @@
       <w:r>
         <w:rPr>
           <w:rFonts w:ascii="Times New Roman" w:hAnsi="Times New Roman"/>
+          <w:color w:val="000000"/>
         </w:rPr>
         <w:t>3. Meta, alcance y unidad funcional</w:t>
       </w:r>
@@ -151,6 +155,7 @@
       <w:r>
         <w:rPr>
           <w:rFonts w:ascii="Times New Roman" w:hAnsi="Times New Roman"/>
+          <w:color w:val="000000"/>
         </w:rPr>
         <w:t>4. Escenarios evaluados</w:t>
       </w:r>
@@ -190,6 +195,7 @@
       <w:r>
         <w:rPr>
           <w:rFonts w:ascii="Times New Roman" w:hAnsi="Times New Roman"/>
+          <w:color w:val="000000"/>
         </w:rPr>
         <w:t>5. Fronteras del sistema</w:t>
       </w:r>
@@ -229,6 +235,7 @@
       <w:r>
         <w:rPr>
           <w:rFonts w:ascii="Times New Roman" w:hAnsi="Times New Roman"/>
+          <w:color w:val="000000"/>
         </w:rPr>
         <w:t>6. Etapas del Escenario A</w:t>
       </w:r>
@@ -268,6 +275,7 @@
       <w:r>
         <w:rPr>
           <w:rFonts w:ascii="Times New Roman" w:hAnsi="Times New Roman"/>
+          <w:color w:val="000000"/>
         </w:rPr>
         <w:t>7. Etapas del Escenario B</w:t>
       </w:r>
@@ -307,6 +315,7 @@
       <w:r>
         <w:rPr>
           <w:rFonts w:ascii="Times New Roman" w:hAnsi="Times New Roman"/>
+          <w:color w:val="000000"/>
         </w:rPr>
         <w:t>8. Datos de entrada usados para el ICV</w:t>
       </w:r>
@@ -375,6 +384,7 @@
         <w:rPr>
           <w:rFonts w:ascii="Times New Roman" w:hAnsi="Times New Roman"/>
           <w:b/>
+          <w:color w:val="000000"/>
         </w:rPr>
         <w:t>Tabla 1</w:t>
       </w:r>
@@ -387,6 +397,7 @@
         <w:rPr>
           <w:rFonts w:ascii="Times New Roman" w:hAnsi="Times New Roman"/>
           <w:i/>
+          <w:color w:val="000000"/>
         </w:rPr>
         <w:t>Caracterización fisicoquímica de los materiales analizados.</w:t>
       </w:r>
@@ -915,6 +926,7 @@
         <w:rPr>
           <w:rFonts w:ascii="Times New Roman" w:hAnsi="Times New Roman"/>
           <w:b/>
+          <w:color w:val="000000"/>
         </w:rPr>
         <w:t>Tabla 2</w:t>
       </w:r>
@@ -927,6 +939,7 @@
         <w:rPr>
           <w:rFonts w:ascii="Times New Roman" w:hAnsi="Times New Roman"/>
           <w:i/>
+          <w:color w:val="000000"/>
         </w:rPr>
         <w:t>Flujos considerados para el inventario de ciclo de vida.</w:t>
       </w:r>
@@ -1222,7 +1235,7 @@
                 <w:b w:val="0"/>
                 <w:sz w:val="24"/>
               </w:rPr>
-              <w:t>kg/ano</w:t>
+              <w:t>kg/año</w:t>
             </w:r>
           </w:p>
         </w:tc>
@@ -1359,7 +1372,7 @@
                 <w:b w:val="0"/>
                 <w:sz w:val="24"/>
               </w:rPr>
-              <w:t>L/ano</w:t>
+              <w:t>L/año</w:t>
             </w:r>
           </w:p>
         </w:tc>
@@ -1496,7 +1509,7 @@
                 <w:b w:val="0"/>
                 <w:sz w:val="24"/>
               </w:rPr>
-              <w:t>kg eq/ano</w:t>
+              <w:t>kg eq/año</w:t>
             </w:r>
           </w:p>
         </w:tc>
@@ -1633,7 +1646,7 @@
                 <w:b w:val="0"/>
                 <w:sz w:val="24"/>
               </w:rPr>
-              <w:t>kg/ano</w:t>
+              <w:t>kg/año</w:t>
             </w:r>
           </w:p>
         </w:tc>
@@ -1770,7 +1783,7 @@
                 <w:b w:val="0"/>
                 <w:sz w:val="24"/>
               </w:rPr>
-              <w:t>L/ano</w:t>
+              <w:t>L/año</w:t>
             </w:r>
           </w:p>
         </w:tc>
@@ -1907,7 +1920,7 @@
                 <w:b w:val="0"/>
                 <w:sz w:val="24"/>
               </w:rPr>
-              <w:t>kg eq/ano</w:t>
+              <w:t>kg eq/año</w:t>
             </w:r>
           </w:p>
         </w:tc>
@@ -2044,7 +2057,7 @@
                 <w:b w:val="0"/>
                 <w:sz w:val="24"/>
               </w:rPr>
-              <w:t>kg/ano</w:t>
+              <w:t>kg/año</w:t>
             </w:r>
           </w:p>
         </w:tc>
@@ -2181,7 +2194,7 @@
                 <w:b w:val="0"/>
                 <w:sz w:val="24"/>
               </w:rPr>
-              <w:t>L/ano</w:t>
+              <w:t>L/año</w:t>
             </w:r>
           </w:p>
         </w:tc>
@@ -2318,7 +2331,7 @@
                 <w:b w:val="0"/>
                 <w:sz w:val="24"/>
               </w:rPr>
-              <w:t>kg eq/ano</w:t>
+              <w:t>kg eq/año</w:t>
             </w:r>
           </w:p>
         </w:tc>
@@ -2455,7 +2468,7 @@
                 <w:b w:val="0"/>
                 <w:sz w:val="24"/>
               </w:rPr>
-              <w:t>kg/ano</w:t>
+              <w:t>kg/año</w:t>
             </w:r>
           </w:p>
         </w:tc>
@@ -2592,7 +2605,7 @@
                 <w:b w:val="0"/>
                 <w:sz w:val="24"/>
               </w:rPr>
-              <w:t>L/ano</w:t>
+              <w:t>L/año</w:t>
             </w:r>
           </w:p>
         </w:tc>
@@ -2729,7 +2742,7 @@
                 <w:b w:val="0"/>
                 <w:sz w:val="24"/>
               </w:rPr>
-              <w:t>kg eq/ano</w:t>
+              <w:t>kg eq/año</w:t>
             </w:r>
           </w:p>
         </w:tc>
@@ -2866,7 +2879,7 @@
                 <w:b w:val="0"/>
                 <w:sz w:val="24"/>
               </w:rPr>
-              <w:t>kg/ano</w:t>
+              <w:t>kg/año</w:t>
             </w:r>
           </w:p>
         </w:tc>
@@ -3003,7 +3016,7 @@
                 <w:b w:val="0"/>
                 <w:sz w:val="24"/>
               </w:rPr>
-              <w:t>L/ano</w:t>
+              <w:t>L/año</w:t>
             </w:r>
           </w:p>
         </w:tc>
@@ -3140,7 +3153,7 @@
                 <w:b w:val="0"/>
                 <w:sz w:val="24"/>
               </w:rPr>
-              <w:t>kg eq/ano</w:t>
+              <w:t>kg eq/año</w:t>
             </w:r>
           </w:p>
         </w:tc>
@@ -3277,7 +3290,7 @@
                 <w:b w:val="0"/>
                 <w:sz w:val="24"/>
               </w:rPr>
-              <w:t>kg/ano</w:t>
+              <w:t>kg/año</w:t>
             </w:r>
           </w:p>
         </w:tc>
@@ -3414,7 +3427,7 @@
                 <w:b w:val="0"/>
                 <w:sz w:val="24"/>
               </w:rPr>
-              <w:t>L/ano</w:t>
+              <w:t>L/año</w:t>
             </w:r>
           </w:p>
         </w:tc>
@@ -3551,7 +3564,7 @@
                 <w:b w:val="0"/>
                 <w:sz w:val="24"/>
               </w:rPr>
-              <w:t>kg eq/ano</w:t>
+              <w:t>kg eq/año</w:t>
             </w:r>
           </w:p>
         </w:tc>
@@ -3605,6 +3618,7 @@
         <w:rPr>
           <w:rFonts w:ascii="Times New Roman" w:hAnsi="Times New Roman"/>
           <w:b/>
+          <w:color w:val="000000"/>
         </w:rPr>
         <w:t>Figura M1</w:t>
       </w:r>
@@ -3617,6 +3631,7 @@
         <w:rPr>
           <w:rFonts w:ascii="Times New Roman" w:hAnsi="Times New Roman"/>
           <w:i/>
+          <w:color w:val="000000"/>
         </w:rPr>
         <w:t>Masa equivalente total por etapa y escenario.</w:t>
       </w:r>
@@ -3628,6 +3643,7 @@
       <w:r>
         <w:rPr>
           <w:rFonts w:ascii="Times New Roman" w:hAnsi="Times New Roman"/>
+          <w:color w:val="000000"/>
         </w:rPr>
         <w:t>9. Muestreo y análisis de laboratorio</w:t>
       </w:r>
@@ -3681,6 +3697,7 @@
       <w:r>
         <w:rPr>
           <w:rFonts w:ascii="Times New Roman" w:hAnsi="Times New Roman"/>
+          <w:color w:val="000000"/>
         </w:rPr>
         <w:t>10. Organización y procesamiento de datos</w:t>
       </w:r>
@@ -3721,6 +3738,7 @@
         <w:rPr>
           <w:rFonts w:ascii="Times New Roman" w:hAnsi="Times New Roman"/>
           <w:b/>
+          <w:color w:val="000000"/>
         </w:rPr>
         <w:t>Tabla 3</w:t>
       </w:r>
@@ -3733,6 +3751,7 @@
         <w:rPr>
           <w:rFonts w:ascii="Times New Roman" w:hAnsi="Times New Roman"/>
           <w:i/>
+          <w:color w:val="000000"/>
         </w:rPr>
         <w:t>Parámetros principales del modelo de estimación de emisiones.</w:t>
       </w:r>
@@ -4575,7 +4594,7 @@
                 <w:b w:val="0"/>
                 <w:sz w:val="24"/>
               </w:rPr>
-              <w:t>kg eq/ano</w:t>
+              <w:t>kg eq/año</w:t>
             </w:r>
           </w:p>
         </w:tc>
@@ -5559,7 +5578,7 @@
                 <w:b w:val="0"/>
                 <w:sz w:val="24"/>
               </w:rPr>
-              <w:t>kg eq/ano</w:t>
+              <w:t>kg eq/año</w:t>
             </w:r>
           </w:p>
         </w:tc>
@@ -6543,7 +6562,7 @@
                 <w:b w:val="0"/>
                 <w:sz w:val="24"/>
               </w:rPr>
-              <w:t>kg eq/ano</w:t>
+              <w:t>kg eq/año</w:t>
             </w:r>
           </w:p>
         </w:tc>
@@ -7526,7 +7545,7 @@
                 <w:b w:val="0"/>
                 <w:sz w:val="24"/>
               </w:rPr>
-              <w:t>kg eq/ano</w:t>
+              <w:t>kg eq/año</w:t>
             </w:r>
           </w:p>
         </w:tc>
@@ -8510,7 +8529,7 @@
                 <w:b w:val="0"/>
                 <w:sz w:val="24"/>
               </w:rPr>
-              <w:t>kg eq/ano</w:t>
+              <w:t>kg eq/año</w:t>
             </w:r>
           </w:p>
         </w:tc>
@@ -9493,7 +9512,7 @@
                 <w:b w:val="0"/>
                 <w:sz w:val="24"/>
               </w:rPr>
-              <w:t>kg eq/ano</w:t>
+              <w:t>kg eq/año</w:t>
             </w:r>
           </w:p>
         </w:tc>
@@ -9834,6 +9853,7 @@
       <w:r>
         <w:rPr>
           <w:rFonts w:ascii="Times New Roman" w:hAnsi="Times New Roman"/>
+          <w:color w:val="000000"/>
         </w:rPr>
         <w:t>11. Cálculo de humedad y materia seca</w:t>
       </w:r>
@@ -9899,6 +9919,7 @@
       <w:r>
         <w:rPr>
           <w:rFonts w:ascii="Times New Roman" w:hAnsi="Times New Roman"/>
+          <w:color w:val="000000"/>
         </w:rPr>
         <w:t>12. Cálculo de cenizas y sólidos volátiles</w:t>
       </w:r>
@@ -9978,6 +9999,7 @@
       <w:r>
         <w:rPr>
           <w:rFonts w:ascii="Times New Roman" w:hAnsi="Times New Roman"/>
+          <w:color w:val="000000"/>
         </w:rPr>
         <w:t>13. Procesamiento de nitrógeno total</w:t>
       </w:r>
@@ -10071,6 +10093,7 @@
       <w:r>
         <w:rPr>
           <w:rFonts w:ascii="Times New Roman" w:hAnsi="Times New Roman"/>
+          <w:color w:val="000000"/>
         </w:rPr>
         <w:t>14. Trazabilidad de masa seca mediante conservación de cenizas</w:t>
       </w:r>
@@ -10163,6 +10186,7 @@
       <w:r>
         <w:rPr>
           <w:rFonts w:ascii="Times New Roman" w:hAnsi="Times New Roman"/>
+          <w:color w:val="000000"/>
         </w:rPr>
         <w:t>15. Construcción de flujos del inventario</w:t>
       </w:r>
@@ -10216,6 +10240,7 @@
       <w:r>
         <w:rPr>
           <w:rFonts w:ascii="Times New Roman" w:hAnsi="Times New Roman"/>
+          <w:color w:val="000000"/>
         </w:rPr>
         <w:t>16. Normalización respecto a la unidad funcional</w:t>
       </w:r>
@@ -10255,6 +10280,7 @@
       <w:r>
         <w:rPr>
           <w:rFonts w:ascii="Times New Roman" w:hAnsi="Times New Roman"/>
+          <w:color w:val="000000"/>
         </w:rPr>
         <w:t>17. Aplicación de ecuaciones IPCC</w:t>
       </w:r>
@@ -10294,6 +10320,7 @@
       <w:r>
         <w:rPr>
           <w:rFonts w:ascii="Times New Roman" w:hAnsi="Times New Roman"/>
+          <w:color w:val="000000"/>
         </w:rPr>
         <w:t>18. Estimación de emisiones</w:t>
       </w:r>
@@ -10333,6 +10360,7 @@
       <w:r>
         <w:rPr>
           <w:rFonts w:ascii="Times New Roman" w:hAnsi="Times New Roman"/>
+          <w:color w:val="000000"/>
         </w:rPr>
         <w:t>19. Evaluación de impacto de ciclo de vida</w:t>
       </w:r>
@@ -10373,6 +10401,7 @@
         <w:rPr>
           <w:rFonts w:ascii="Times New Roman" w:hAnsi="Times New Roman"/>
           <w:b/>
+          <w:color w:val="000000"/>
         </w:rPr>
         <w:t>Tabla 4</w:t>
       </w:r>
@@ -10385,6 +10414,7 @@
         <w:rPr>
           <w:rFonts w:ascii="Times New Roman" w:hAnsi="Times New Roman"/>
           <w:i/>
+          <w:color w:val="000000"/>
         </w:rPr>
         <w:t>Factores de caracterización para las categorías de impacto.</w:t>
       </w:r>
@@ -11078,6 +11108,7 @@
       <w:r>
         <w:rPr>
           <w:rFonts w:ascii="Times New Roman" w:hAnsi="Times New Roman"/>
+          <w:color w:val="000000"/>
         </w:rPr>
         <w:t>20. Supuestos metodológicos</w:t>
       </w:r>
@@ -11117,6 +11148,7 @@
       <w:r>
         <w:rPr>
           <w:rFonts w:ascii="Times New Roman" w:hAnsi="Times New Roman"/>
+          <w:color w:val="000000"/>
         </w:rPr>
         <w:t>21. Limitaciones metodológicas</w:t>
       </w:r>
@@ -11156,6 +11188,7 @@
       <w:r>
         <w:rPr>
           <w:rFonts w:ascii="Times New Roman" w:hAnsi="Times New Roman"/>
+          <w:color w:val="000000"/>
         </w:rPr>
         <w:t>Apéndices internos de metodología</w:t>
       </w:r>
@@ -11181,6 +11214,7 @@
       <w:r>
         <w:rPr>
           <w:rFonts w:ascii="Times New Roman" w:hAnsi="Times New Roman"/>
+          <w:color w:val="000000"/>
         </w:rPr>
         <w:t>Apéndice interno A. Parámetros completos del modelo ACV</w:t>
       </w:r>
@@ -11193,6 +11227,7 @@
         <w:rPr>
           <w:rFonts w:ascii="Times New Roman" w:hAnsi="Times New Roman"/>
           <w:b/>
+          <w:color w:val="000000"/>
         </w:rPr>
         <w:t>Tabla M1</w:t>
       </w:r>
@@ -11205,6 +11240,7 @@
         <w:rPr>
           <w:rFonts w:ascii="Times New Roman" w:hAnsi="Times New Roman"/>
           <w:i/>
+          <w:color w:val="000000"/>
         </w:rPr>
         <w:t>Parámetros completos usados por escenario y etapa.</w:t>
       </w:r>
@@ -12319,7 +12355,7 @@
                 <w:b w:val="0"/>
                 <w:sz w:val="24"/>
               </w:rPr>
-              <w:t>kg eq/ano</w:t>
+              <w:t>kg eq/año</w:t>
             </w:r>
           </w:p>
         </w:tc>
@@ -14063,7 +14099,7 @@
                 <w:b w:val="0"/>
                 <w:sz w:val="24"/>
               </w:rPr>
-              <w:t>kg eq/ano</w:t>
+              <w:t>kg eq/año</w:t>
             </w:r>
           </w:p>
         </w:tc>
@@ -15807,7 +15843,7 @@
                 <w:b w:val="0"/>
                 <w:sz w:val="24"/>
               </w:rPr>
-              <w:t>kg eq/ano</w:t>
+              <w:t>kg eq/año</w:t>
             </w:r>
           </w:p>
         </w:tc>
@@ -17550,7 +17586,7 @@
                 <w:b w:val="0"/>
                 <w:sz w:val="24"/>
               </w:rPr>
-              <w:t>kg eq/ano</w:t>
+              <w:t>kg eq/año</w:t>
             </w:r>
           </w:p>
         </w:tc>
@@ -19294,7 +19330,7 @@
                 <w:b w:val="0"/>
                 <w:sz w:val="24"/>
               </w:rPr>
-              <w:t>kg eq/ano</w:t>
+              <w:t>kg eq/año</w:t>
             </w:r>
           </w:p>
         </w:tc>
@@ -21037,7 +21073,7 @@
                 <w:b w:val="0"/>
                 <w:sz w:val="24"/>
               </w:rPr>
-              <w:t>kg eq/ano</w:t>
+              <w:t>kg eq/año</w:t>
             </w:r>
           </w:p>
         </w:tc>
@@ -21922,6 +21958,7 @@
       <w:r>
         <w:rPr>
           <w:rFonts w:ascii="Times New Roman" w:hAnsi="Times New Roman"/>
+          <w:color w:val="000000"/>
         </w:rPr>
         <w:t>Apéndice interno B. Factores de emisión y caracterización</w:t>
       </w:r>
@@ -21934,6 +21971,7 @@
         <w:rPr>
           <w:rFonts w:ascii="Times New Roman" w:hAnsi="Times New Roman"/>
           <w:b/>
+          <w:color w:val="000000"/>
         </w:rPr>
         <w:t>Tabla M2</w:t>
       </w:r>
@@ -21946,6 +21984,7 @@
         <w:rPr>
           <w:rFonts w:ascii="Times New Roman" w:hAnsi="Times New Roman"/>
           <w:i/>
+          <w:color w:val="000000"/>
         </w:rPr>
         <w:t>Factores técnicos usados en el modelo.</w:t>
       </w:r>
@@ -28128,7 +28167,7 @@
                 <w:b w:val="0"/>
                 <w:sz w:val="24"/>
               </w:rPr>
-              <w:t>kg N/ano</w:t>
+              <w:t>kg N/año</w:t>
             </w:r>
           </w:p>
         </w:tc>
@@ -30317,6 +30356,7 @@
       <w:r>
         <w:rPr>
           <w:rFonts w:ascii="Times New Roman" w:hAnsi="Times New Roman"/>
+          <w:color w:val="000000"/>
         </w:rPr>
         <w:t>Apéndice interno C. Diccionario de variables metodológicas</w:t>
       </w:r>
@@ -30329,6 +30369,7 @@
         <w:rPr>
           <w:rFonts w:ascii="Times New Roman" w:hAnsi="Times New Roman"/>
           <w:b/>
+          <w:color w:val="000000"/>
         </w:rPr>
         <w:t>Tabla M3</w:t>
       </w:r>
@@ -30341,6 +30382,7 @@
         <w:rPr>
           <w:rFonts w:ascii="Times New Roman" w:hAnsi="Times New Roman"/>
           <w:i/>
+          <w:color w:val="000000"/>
         </w:rPr>
         <w:t>Diccionario de variables metodológicas.</w:t>
       </w:r>
@@ -31024,7 +31066,7 @@
                 <w:b w:val="0"/>
                 <w:sz w:val="24"/>
               </w:rPr>
-              <w:t>kg eq/ano</w:t>
+              <w:t>kg eq/año</w:t>
             </w:r>
           </w:p>
         </w:tc>
@@ -31522,7 +31564,7 @@
                 <w:b w:val="0"/>
                 <w:sz w:val="24"/>
               </w:rPr>
-              <w:t>kg CO₂-eq/ano o kg PO₄-eq/ano</w:t>
+              <w:t>kg CO₂-eq/año o kg PO₄-eq/año</w:t>
             </w:r>
           </w:p>
         </w:tc>
@@ -31908,6 +31950,7 @@
     </w:pPr>
     <w:rPr>
       <w:rFonts w:ascii="Times New Roman" w:hAnsi="Times New Roman" w:eastAsia="Times New Roman"/>
+      <w:color w:val="000000"/>
       <w:sz w:val="24"/>
     </w:rPr>
   </w:style>
@@ -31976,7 +32019,7 @@
       <w:b/>
       <w:bCs/>
       <w:i w:val="0"/>
-      <w:color w:val="365F91" w:themeColor="accent1" w:themeShade="BF"/>
+      <w:color w:val="000000"/>
       <w:sz w:val="24"/>
       <w:szCs w:val="28"/>
     </w:rPr>
@@ -32003,7 +32046,7 @@
       <w:b/>
       <w:bCs/>
       <w:i w:val="0"/>
-      <w:color w:val="4F81BD" w:themeColor="accent1"/>
+      <w:color w:val="000000"/>
       <w:sz w:val="24"/>
       <w:szCs w:val="26"/>
     </w:rPr>
@@ -32030,7 +32073,7 @@
       <w:b/>
       <w:bCs/>
       <w:i w:val="0"/>
-      <w:color w:val="4F81BD" w:themeColor="accent1"/>
+      <w:color w:val="000000"/>
       <w:sz w:val="24"/>
     </w:rPr>
   </w:style>
@@ -32274,7 +32317,7 @@
       <w:rFonts w:asciiTheme="majorHAnsi" w:eastAsiaTheme="majorEastAsia" w:hAnsiTheme="majorHAnsi" w:cstheme="majorBidi" w:ascii="Times New Roman" w:hAnsi="Times New Roman" w:eastAsia="Times New Roman"/>
       <w:b w:val="0"/>
       <w:i/>
-      <w:color w:val="17365D" w:themeColor="text2" w:themeShade="BF"/>
+      <w:color w:val="000000"/>
       <w:spacing w:val="5"/>
       <w:kern w:val="28"/>
       <w:sz w:val="32"/>
@@ -32313,7 +32356,7 @@
       <w:rFonts w:asciiTheme="majorHAnsi" w:eastAsiaTheme="majorEastAsia" w:hAnsiTheme="majorHAnsi" w:cstheme="majorBidi"/>
       <w:i/>
       <w:iCs/>
-      <w:color w:val="4F81BD" w:themeColor="accent1"/>
+      <w:color w:val="000000"/>
       <w:spacing w:val="15"/>
       <w:sz w:val="24"/>
       <w:szCs w:val="24"/>
@@ -32717,7 +32760,7 @@
     <w:rPr>
       <w:b/>
       <w:bCs/>
-      <w:color w:val="4F81BD" w:themeColor="accent1"/>
+      <w:color w:val="000000"/>
       <w:sz w:val="18"/>
       <w:szCs w:val="18"/>
     </w:rPr>
@@ -43618,6 +43661,7 @@
       <w:rFonts w:ascii="Times New Roman" w:hAnsi="Times New Roman" w:eastAsia="Times New Roman"/>
       <w:b/>
       <w:i w:val="0"/>
+      <w:color w:val="000000"/>
       <w:sz w:val="24"/>
     </w:rPr>
   </w:style>
@@ -43632,6 +43676,7 @@
       <w:rFonts w:ascii="Times New Roman" w:hAnsi="Times New Roman" w:eastAsia="Times New Roman"/>
       <w:b w:val="0"/>
       <w:i/>
+      <w:color w:val="000000"/>
       <w:sz w:val="24"/>
     </w:rPr>
   </w:style>

</xml_diff>

<commit_message>
Fix table captions and figure title placement
</commit_message>
<xml_diff>
--- a/outputs/documentos_tfg/metodologia_desarrollada_tfg.docx
+++ b/outputs/documentos_tfg/metodologia_desarrollada_tfg.docx
@@ -3572,6 +3572,32 @@
     </w:tbl>
     <w:p>
       <w:pPr>
+        <w:pStyle w:val="Rótuloacadémico"/>
+      </w:pPr>
+      <w:r>
+        <w:rPr>
+          <w:rFonts w:ascii="Times New Roman" w:hAnsi="Times New Roman"/>
+          <w:b/>
+          <w:color w:val="000000"/>
+        </w:rPr>
+        <w:t>Figura M1</w:t>
+      </w:r>
+    </w:p>
+    <w:p>
+      <w:pPr>
+        <w:pStyle w:val="Descripciónacadémica"/>
+      </w:pPr>
+      <w:r>
+        <w:rPr>
+          <w:rFonts w:ascii="Times New Roman" w:hAnsi="Times New Roman"/>
+          <w:i/>
+          <w:color w:val="000000"/>
+        </w:rPr>
+        <w:t>Masa equivalente total por etapa y escenario.</w:t>
+      </w:r>
+    </w:p>
+    <w:p>
+      <w:pPr>
         <w:ind w:left="0" w:firstLine="0"/>
         <w:jc w:val="center"/>
       </w:pPr>
@@ -3608,32 +3634,6 @@
             </a:graphic>
           </wp:inline>
         </w:drawing>
-      </w:r>
-    </w:p>
-    <w:p>
-      <w:pPr>
-        <w:pStyle w:val="Rótuloacadémico"/>
-      </w:pPr>
-      <w:r>
-        <w:rPr>
-          <w:rFonts w:ascii="Times New Roman" w:hAnsi="Times New Roman"/>
-          <w:b/>
-          <w:color w:val="000000"/>
-        </w:rPr>
-        <w:t>Figura M1</w:t>
-      </w:r>
-    </w:p>
-    <w:p>
-      <w:pPr>
-        <w:pStyle w:val="Descripciónacadémica"/>
-      </w:pPr>
-      <w:r>
-        <w:rPr>
-          <w:rFonts w:ascii="Times New Roman" w:hAnsi="Times New Roman"/>
-          <w:i/>
-          <w:color w:val="000000"/>
-        </w:rPr>
-        <w:t>Masa equivalente total por etapa y escenario.</w:t>
       </w:r>
     </w:p>
     <w:p>

</xml_diff>

<commit_message>
Polish thesis graphics, language, and appendix references
</commit_message>
<xml_diff>
--- a/outputs/documentos_tfg/metodologia_desarrollada_tfg.docx
+++ b/outputs/documentos_tfg/metodologia_desarrollada_tfg.docx
@@ -3604,7 +3604,7 @@
       <w:r>
         <w:drawing>
           <wp:inline xmlns:a="http://schemas.openxmlformats.org/drawingml/2006/main" xmlns:pic="http://schemas.openxmlformats.org/drawingml/2006/picture">
-            <wp:extent cx="5669280" cy="2802840"/>
+            <wp:extent cx="5669280" cy="2808756"/>
             <wp:docPr id="1" name="Picture 1"/>
             <wp:cNvGraphicFramePr>
               <a:graphicFrameLocks noChangeAspect="1"/>
@@ -3625,7 +3625,7 @@
                   <pic:spPr>
                     <a:xfrm>
                       <a:off x="0" y="0"/>
-                      <a:ext cx="5669280" cy="2802840"/>
+                      <a:ext cx="5669280" cy="2808756"/>
                     </a:xfrm>
                     <a:prstGeom prst="rect"/>
                   </pic:spPr>
@@ -3728,6 +3728,20 @@
           <w:sz w:val="24"/>
         </w:rPr>
         <w:t>Posteriormente, las variables de laboratorio fueron transformadas en fracciones o masas equivalentes según la unidad requerida por cada ecuación. Los parámetros principales empleados en este proceso se presentan en la Tabla 3.</w:t>
+      </w:r>
+    </w:p>
+    <w:p>
+      <w:pPr>
+        <w:spacing w:line="240" w:lineRule="auto" w:before="0" w:after="0"/>
+        <w:ind w:left="100" w:firstLine="719"/>
+        <w:jc w:val="both"/>
+      </w:pPr>
+      <w:r>
+        <w:rPr>
+          <w:rFonts w:ascii="Times New Roman" w:hAnsi="Times New Roman"/>
+          <w:sz w:val="24"/>
+        </w:rPr>
+        <w:t>La información completa de los parámetros utilizados en el modelo se presenta en el Apéndice interno A, Parámetros completos del modelo ACV.</w:t>
       </w:r>
     </w:p>
     <w:p>
@@ -10034,6 +10048,20 @@
     </w:p>
     <w:p>
       <w:pPr>
+        <w:spacing w:line="240" w:lineRule="auto" w:before="0" w:after="0"/>
+        <w:ind w:left="100" w:firstLine="719"/>
+        <w:jc w:val="both"/>
+      </w:pPr>
+      <w:r>
+        <w:rPr>
+          <w:rFonts w:ascii="Times New Roman" w:hAnsi="Times New Roman"/>
+          <w:sz w:val="24"/>
+        </w:rPr>
+        <w:t>La definición académica de las variables empleadas en esta sección y en las demás ecuaciones se reúne en el Apéndice interno C, Diccionario de variables metodológicas.</w:t>
+      </w:r>
+    </w:p>
+    <w:p>
+      <w:pPr>
         <w:ind w:left="0" w:firstLine="0"/>
         <w:jc w:val="center"/>
       </w:pPr>
@@ -10056,7 +10084,7 @@
           <w:rFonts w:ascii="Times New Roman" w:hAnsi="Times New Roman"/>
           <w:sz w:val="24"/>
         </w:rPr>
-        <w:t>Donde: n ex,pct = nitrógeno total reportado en porcentaje, %; n ex,fraction = fracción másica de nitrógeno, kg N/kg muestra.</w:t>
+        <w:t>Donde: n ex,pct = nitrógeno total reportado en porcentaje, %; n ex,Fracción = fracción másica de nitrógeno, kg N/kg muestra.</w:t>
       </w:r>
     </w:p>
     <w:p>
@@ -10315,6 +10343,20 @@
     </w:p>
     <w:p>
       <w:pPr>
+        <w:spacing w:line="240" w:lineRule="auto" w:before="0" w:after="0"/>
+        <w:ind w:left="100" w:firstLine="719"/>
+        <w:jc w:val="both"/>
+      </w:pPr>
+      <w:r>
+        <w:rPr>
+          <w:rFonts w:ascii="Times New Roman" w:hAnsi="Times New Roman"/>
+          <w:sz w:val="24"/>
+        </w:rPr>
+        <w:t>Los factores de emisión y caracterización empleados en estas estimaciones se detallan en el Apéndice interno B, Factores de emisión y caracterización.</w:t>
+      </w:r>
+    </w:p>
+    <w:p>
+      <w:pPr>
         <w:pStyle w:val="Heading2"/>
       </w:pPr>
       <w:r>
@@ -10336,7 +10378,7 @@
           <w:rFonts w:ascii="Times New Roman" w:hAnsi="Times New Roman"/>
           <w:sz w:val="24"/>
         </w:rPr>
-        <w:t>Las emisiones se estimaron por escenario, etapa y sustancia. Las sustancias consideradas fueron CO₂, CH₄, N₂O, NH₃ y NO₃⁻. Las ecuaciones de nitrógeno utilizaron n ex,fraction como fracción másica de entrada.</w:t>
+        <w:t>Las emisiones se estimaron por escenario, etapa y sustancia. Las sustancias consideradas fueron CO₂, CH₄, N₂O, NH₃ y NO₃⁻. Las ecuaciones de nitrógeno utilizaron n ex,Fracción como fracción másica de entrada.</w:t>
       </w:r>
     </w:p>
     <w:p>

</xml_diff>